<commit_message>
resolves A-01 for Discussion updated ADR-004 and reelated documents
</commit_message>
<xml_diff>
--- a/docs/ADR/ADR-004.docx
+++ b/docs/ADR/ADR-004.docx
@@ -491,7 +491,7 @@
                 <w:sz w:val="18"/>
                 <w:szCs w:val="18"/>
               </w:rPr>
-              <w:t xml:space="preserve">Open Question</w:t>
+              <w:t xml:space="preserve">Encoding Decision</w:t>
             </w:r>
           </w:p>
         </w:tc>
@@ -504,7 +504,7 @@
               <w:bottom w:val="single" w:color="CCCCCC" w:sz="1"/>
               <w:right w:val="single" w:color="CCCCCC" w:sz="1"/>
             </w:tcBorders>
-            <w:shd w:fill="EBF3FB" w:val="clear"/>
+            <w:shd w:fill="E2EFDA" w:val="clear"/>
             <w:tcMar>
               <w:top w:type="dxa" w:w="80"/>
               <w:left w:type="dxa" w:w="140"/>
@@ -519,7 +519,7 @@
                 <w:sz w:val="18"/>
                 <w:szCs w:val="18"/>
               </w:rPr>
-              <w:t xml:space="preserve">Canonical encoding (raw bytes vs DER) — assigned to Glenn, Week 1. Update this ADR when resolved.</w:t>
+              <w:t xml:space="preserve">RESOLVED 2026-03-21: Raw bytes. See Section 7 of this ADR and FOR_DISCUSSION Section E.</w:t>
             </w:r>
           </w:p>
         </w:tc>
@@ -822,17 +822,29 @@
     </w:p>
     <w:p>
       <w:pPr>
-        <w:shd w:fill="FFF2CC" w:val="clear"/>
+        <w:shd w:fill="E2EFDA" w:val="clear"/>
         <w:spacing w:before="100" w:after="100"/>
         <w:ind w:left="180" w:right="180"/>
       </w:pPr>
       <w:r>
         <w:rPr>
           <w:rFonts w:ascii="Arial" w:cs="Arial" w:eastAsia="Arial" w:hAnsi="Arial"/>
-          <w:sz w:val="20"/>
-          <w:szCs w:val="20"/>
-        </w:rPr>
-        <w:t xml:space="preserve">OPEN: Canonical encoding for MessageEnvelope signatures — raw bytes or DER? Assigned to Glenn, Week 1. This ADR must be updated once resolved.</w:t>
+          <w:b/>
+          <w:bCs/>
+          <w:color w:val="375623"/>
+          <w:sz w:val="20"/>
+          <w:szCs w:val="20"/>
+        </w:rPr>
+        <w:t xml:space="preserve">RESOLVED 2026-03-21 (FOR_DISCUSSION A-01): </w:t>
+      </w:r>
+      <w:r>
+        <w:rPr>
+          <w:rFonts w:ascii="Arial" w:cs="Arial" w:eastAsia="Arial" w:hAnsi="Arial"/>
+          <w:color w:val="375623"/>
+          <w:sz w:val="20"/>
+          <w:szCs w:val="20"/>
+        </w:rPr>
+        <w:t xml:space="preserve">ML-DSA signatures in MessageEnvelope are encoded as raw bytes — the unmodified []byte output of mldsa65.Sign(), exactly 3,309 bytes, with no DER wrapping or normalization. See Section 7 for full rationale, implementation contract, and alternatives considered.</w:t>
       </w:r>
     </w:p>
     <w:p>
@@ -1907,7 +1919,467 @@
           <w:sz w:val="32"/>
           <w:szCs w:val="32"/>
         </w:rPr>
-        <w:t xml:space="preserve">6. Related ADRs</w:t>
+        <w:t xml:space="preserve">6. Canonical Encoding for ML-DSA Signatures [A-01 RESOLVED]</w:t>
+      </w:r>
+    </w:p>
+    <w:p>
+      <w:pPr>
+        <w:spacing w:before="60" w:after="80"/>
+      </w:pPr>
+      <w:r>
+        <w:rPr>
+          <w:rFonts w:ascii="Arial" w:cs="Arial" w:eastAsia="Arial" w:hAnsi="Arial"/>
+          <w:i/>
+          <w:iCs/>
+          <w:color w:val="555555"/>
+          <w:sz w:val="18"/>
+          <w:szCs w:val="18"/>
+        </w:rPr>
+        <w:t xml:space="preserve">Decision date: 2026-03-21  |  Resolves: FOR_DISCUSSION A-01  |  Cross-referenced: PROTOCOL_SPEC v1.2 Section 4.1, SAFEGROWTH_REQUIREMENTS v1.3 CR-03</w:t>
+      </w:r>
+    </w:p>
+    <w:p>
+      <w:pPr>
+        <w:pStyle w:val="Heading2"/>
+        <w:spacing w:before="240" w:after="120"/>
+      </w:pPr>
+      <w:r>
+        <w:rPr>
+          <w:rFonts w:ascii="Arial" w:cs="Arial" w:eastAsia="Arial" w:hAnsi="Arial"/>
+          <w:b/>
+          <w:bCs/>
+          <w:color w:val="2E75B6"/>
+          <w:sz w:val="26"/>
+          <w:szCs w:val="26"/>
+        </w:rPr>
+        <w:t xml:space="preserve">6.1 Decision</w:t>
+      </w:r>
+    </w:p>
+    <w:p>
+      <w:pPr>
+        <w:shd w:fill="E2EFDA" w:val="clear"/>
+        <w:spacing w:before="100" w:after="100"/>
+        <w:ind w:left="180" w:right="180"/>
+      </w:pPr>
+      <w:r>
+        <w:rPr>
+          <w:rFonts w:ascii="Arial" w:cs="Arial" w:eastAsia="Arial" w:hAnsi="Arial"/>
+          <w:b/>
+          <w:bCs/>
+          <w:color w:val="375623"/>
+          <w:sz w:val="20"/>
+          <w:szCs w:val="20"/>
+        </w:rPr>
+        <w:t xml:space="preserve">ML-DSA signatures in MessageEnvelope MUST be encoded as raw bytes: the unmodified []byte output of mldsa65.Sign(), with no DER wrapping, no ASN.1 framing, no normalization, and no additional length prefix. The signature field MUST be exactly 3,309 bytes.</w:t>
+      </w:r>
+    </w:p>
+    <w:p>
+      <w:pPr>
+        <w:spacing w:before="100" w:after="100"/>
+      </w:pPr>
+      <w:r>
+        <w:t xml:space="preserve"/>
+      </w:r>
+    </w:p>
+    <w:p>
+      <w:pPr>
+        <w:pStyle w:val="Heading2"/>
+        <w:spacing w:before="240" w:after="120"/>
+      </w:pPr>
+      <w:r>
+        <w:rPr>
+          <w:rFonts w:ascii="Arial" w:cs="Arial" w:eastAsia="Arial" w:hAnsi="Arial"/>
+          <w:b/>
+          <w:bCs/>
+          <w:color w:val="2E75B6"/>
+          <w:sz w:val="26"/>
+          <w:szCs w:val="26"/>
+        </w:rPr>
+        <w:t xml:space="preserve">6.2 Rationale</w:t>
+      </w:r>
+    </w:p>
+    <w:p>
+      <w:pPr>
+        <w:pStyle w:val="ListParagraph"/>
+        <w:numPr>
+          <w:ilvl w:val="0"/>
+          <w:numId w:val="2"/>
+        </w:numPr>
+        <w:spacing w:before="50" w:after="50"/>
+      </w:pPr>
+      <w:r>
+        <w:rPr>
+          <w:rFonts w:ascii="Arial" w:cs="Arial" w:eastAsia="Arial" w:hAnsi="Arial"/>
+          <w:b/>
+          <w:bCs/>
+          <w:sz w:val="20"/>
+          <w:szCs w:val="20"/>
+        </w:rPr>
+        <w:t xml:space="preserve">Fixed-length output eliminates DER’s value proposition. </w:t>
+      </w:r>
+      <w:r>
+        <w:rPr>
+          <w:rFonts w:ascii="Arial" w:cs="Arial" w:eastAsia="Arial" w:hAnsi="Arial"/>
+          <w:sz w:val="20"/>
+          <w:szCs w:val="20"/>
+        </w:rPr>
+        <w:t xml:space="preserve">ML-DSA-65 signatures are always exactly 3,309 bytes. DER’s TLV (tag-length-value) structure exists to delimit variable-length types. For a fixed-length type there is no ambiguity about boundaries and no benefit from a structural wrapper.</w:t>
+      </w:r>
+    </w:p>
+    <w:p>
+      <w:pPr>
+        <w:pStyle w:val="ListParagraph"/>
+        <w:numPr>
+          <w:ilvl w:val="0"/>
+          <w:numId w:val="2"/>
+        </w:numPr>
+        <w:spacing w:before="50" w:after="50"/>
+      </w:pPr>
+      <w:r>
+        <w:rPr>
+          <w:rFonts w:ascii="Arial" w:cs="Arial" w:eastAsia="Arial" w:hAnsi="Arial"/>
+          <w:b/>
+          <w:bCs/>
+          <w:sz w:val="20"/>
+          <w:szCs w:val="20"/>
+        </w:rPr>
+        <w:t xml:space="preserve">No cross-platform interop requirement exists. </w:t>
+      </w:r>
+      <w:r>
+        <w:rPr>
+          <w:rFonts w:ascii="Arial" w:cs="Arial" w:eastAsia="Arial" w:hAnsi="Arial"/>
+          <w:sz w:val="20"/>
+          <w:szCs w:val="20"/>
+        </w:rPr>
+        <w:t xml:space="preserve">SafeGrowth Vault is a closed node-to-node protocol. No external system (HSM, Java Signature, openssl) needs to consume these signatures. The primary motivation for DER — cross-platform tool compatibility — does not apply.</w:t>
+      </w:r>
+    </w:p>
+    <w:p>
+      <w:pPr>
+        <w:pStyle w:val="ListParagraph"/>
+        <w:numPr>
+          <w:ilvl w:val="0"/>
+          <w:numId w:val="2"/>
+        </w:numPr>
+        <w:spacing w:before="50" w:after="50"/>
+      </w:pPr>
+      <w:r>
+        <w:rPr>
+          <w:rFonts w:ascii="Arial" w:cs="Arial" w:eastAsia="Arial" w:hAnsi="Arial"/>
+          <w:b/>
+          <w:bCs/>
+          <w:sz w:val="20"/>
+          <w:szCs w:val="20"/>
+        </w:rPr>
+        <w:t xml:space="preserve">Reduced attack surface. </w:t>
+      </w:r>
+      <w:r>
+        <w:rPr>
+          <w:rFonts w:ascii="Arial" w:cs="Arial" w:eastAsia="Arial" w:hAnsi="Arial"/>
+          <w:sz w:val="20"/>
+          <w:szCs w:val="20"/>
+        </w:rPr>
+        <w:t xml:space="preserve">DER parsers carry a documented CVE history: malformed length encodings, indefinite-length forms, and leading-zero padding issues have produced real vulnerabilities in X.509 stacks. A fixed-length []byte copy has none of this surface.</w:t>
+      </w:r>
+    </w:p>
+    <w:p>
+      <w:pPr>
+        <w:pStyle w:val="ListParagraph"/>
+        <w:numPr>
+          <w:ilvl w:val="0"/>
+          <w:numId w:val="2"/>
+        </w:numPr>
+        <w:spacing w:before="50" w:after="50"/>
+      </w:pPr>
+      <w:r>
+        <w:rPr>
+          <w:rFonts w:ascii="Arial" w:cs="Arial" w:eastAsia="Arial" w:hAnsi="Arial"/>
+          <w:b/>
+          <w:bCs/>
+          <w:sz w:val="20"/>
+          <w:szCs w:val="20"/>
+        </w:rPr>
+        <w:t xml:space="preserve">Canonical by contract. </w:t>
+      </w:r>
+      <w:r>
+        <w:rPr>
+          <w:rFonts w:ascii="Arial" w:cs="Arial" w:eastAsia="Arial" w:hAnsi="Arial"/>
+          <w:sz w:val="20"/>
+          <w:szCs w:val="20"/>
+        </w:rPr>
+        <w:t xml:space="preserve">Any two compliant implementations producing an ML-DSA-65 signature from the same key and message will emit identical 3,309-byte outputs. The encoding is canonical by reference to the mldsa65.Sign() output contract; no additional canonicalization step is needed or permitted.</w:t>
+      </w:r>
+    </w:p>
+    <w:p>
+      <w:pPr>
+        <w:pStyle w:val="ListParagraph"/>
+        <w:numPr>
+          <w:ilvl w:val="0"/>
+          <w:numId w:val="2"/>
+        </w:numPr>
+        <w:spacing w:before="50" w:after="50"/>
+      </w:pPr>
+      <w:r>
+        <w:rPr>
+          <w:rFonts w:ascii="Arial" w:cs="Arial" w:eastAsia="Arial" w:hAnsi="Arial"/>
+          <w:b/>
+          <w:bCs/>
+          <w:sz w:val="20"/>
+          <w:szCs w:val="20"/>
+        </w:rPr>
+        <w:t xml:space="preserve">Parameter set migration is not a current requirement. </w:t>
+      </w:r>
+      <w:r>
+        <w:rPr>
+          <w:rFonts w:ascii="Arial" w:cs="Arial" w:eastAsia="Arial" w:hAnsi="Arial"/>
+          <w:sz w:val="20"/>
+          <w:szCs w:val="20"/>
+        </w:rPr>
+        <w:t xml:space="preserve">If ML-DSA-44 or ML-DSA-87 support is ever required, it warrants a new protocol version and a new ADR. Adding DER overhead to every v1 message in anticipation of a scenario that may never occur adds complexity without benefit.</w:t>
+      </w:r>
+    </w:p>
+    <w:p>
+      <w:pPr>
+        <w:spacing w:before="100" w:after="100"/>
+      </w:pPr>
+      <w:r>
+        <w:t xml:space="preserve"/>
+      </w:r>
+    </w:p>
+    <w:p>
+      <w:pPr>
+        <w:pStyle w:val="Heading2"/>
+        <w:spacing w:before="240" w:after="120"/>
+      </w:pPr>
+      <w:r>
+        <w:rPr>
+          <w:rFonts w:ascii="Arial" w:cs="Arial" w:eastAsia="Arial" w:hAnsi="Arial"/>
+          <w:b/>
+          <w:bCs/>
+          <w:color w:val="2E75B6"/>
+          <w:sz w:val="26"/>
+          <w:szCs w:val="26"/>
+        </w:rPr>
+        <w:t xml:space="preserve">6.3 Implementation Contract</w:t>
+      </w:r>
+    </w:p>
+    <w:p>
+      <w:pPr>
+        <w:spacing w:before="60" w:after="80"/>
+      </w:pPr>
+      <w:r>
+        <w:rPr>
+          <w:rFonts w:ascii="Arial" w:cs="Arial" w:eastAsia="Arial" w:hAnsi="Arial"/>
+          <w:sz w:val="20"/>
+          <w:szCs w:val="20"/>
+        </w:rPr>
+        <w:t xml:space="preserve">All implementations MUST:</w:t>
+      </w:r>
+    </w:p>
+    <w:p>
+      <w:pPr>
+        <w:pStyle w:val="ListParagraph"/>
+        <w:numPr>
+          <w:ilvl w:val="0"/>
+          <w:numId w:val="3"/>
+        </w:numPr>
+        <w:spacing w:before="50" w:after="50"/>
+      </w:pPr>
+      <w:r>
+        <w:rPr>
+          <w:rFonts w:ascii="Arial" w:cs="Arial" w:eastAsia="Arial" w:hAnsi="Arial"/>
+          <w:sz w:val="20"/>
+          <w:szCs w:val="20"/>
+        </w:rPr>
+        <w:t xml:space="preserve">Write the signature field in MessageEnvelope as exactly 3,309 raw bytes (the direct, unmodified output of mldsa65.Sign())</w:t>
+      </w:r>
+    </w:p>
+    <w:p>
+      <w:pPr>
+        <w:pStyle w:val="ListParagraph"/>
+        <w:numPr>
+          <w:ilvl w:val="0"/>
+          <w:numId w:val="3"/>
+        </w:numPr>
+        <w:spacing w:before="50" w:after="50"/>
+      </w:pPr>
+      <w:r>
+        <w:rPr>
+          <w:rFonts w:ascii="Arial" w:cs="Arial" w:eastAsia="Arial" w:hAnsi="Arial"/>
+          <w:sz w:val="20"/>
+          <w:szCs w:val="20"/>
+        </w:rPr>
+        <w:t xml:space="preserve">Pass those bytes unmodified to mldsa65.Verify() on the read path</w:t>
+      </w:r>
+    </w:p>
+    <w:p>
+      <w:pPr>
+        <w:pStyle w:val="ListParagraph"/>
+        <w:numPr>
+          <w:ilvl w:val="0"/>
+          <w:numId w:val="3"/>
+        </w:numPr>
+        <w:spacing w:before="50" w:after="50"/>
+      </w:pPr>
+      <w:r>
+        <w:rPr>
+          <w:rFonts w:ascii="Arial" w:cs="Arial" w:eastAsia="Arial" w:hAnsi="Arial"/>
+          <w:sz w:val="20"/>
+          <w:szCs w:val="20"/>
+        </w:rPr>
+        <w:t xml:space="preserve">Reject any MessageEnvelope whose signature field is not exactly 3,309 bytes with error E-006 INVALID_SIGNATURE and close the connection</w:t>
+      </w:r>
+    </w:p>
+    <w:p>
+      <w:pPr>
+        <w:pStyle w:val="ListParagraph"/>
+        <w:numPr>
+          <w:ilvl w:val="0"/>
+          <w:numId w:val="3"/>
+        </w:numPr>
+        <w:spacing w:before="50" w:after="50"/>
+      </w:pPr>
+      <w:r>
+        <w:rPr>
+          <w:rFonts w:ascii="Arial" w:cs="Arial" w:eastAsia="Arial" w:hAnsi="Arial"/>
+          <w:sz w:val="20"/>
+          <w:szCs w:val="20"/>
+        </w:rPr>
+        <w:t xml:space="preserve">Never apply DER encoding, ASN.1 wrapping, base64 encoding, or any other transformation to the signature bytes before writing or after reading</w:t>
+      </w:r>
+    </w:p>
+    <w:p>
+      <w:pPr>
+        <w:spacing w:before="100" w:after="100"/>
+      </w:pPr>
+      <w:r>
+        <w:t xml:space="preserve"/>
+      </w:r>
+    </w:p>
+    <w:p>
+      <w:pPr>
+        <w:pStyle w:val="Heading2"/>
+        <w:spacing w:before="240" w:after="120"/>
+      </w:pPr>
+      <w:r>
+        <w:rPr>
+          <w:rFonts w:ascii="Arial" w:cs="Arial" w:eastAsia="Arial" w:hAnsi="Arial"/>
+          <w:b/>
+          <w:bCs/>
+          <w:color w:val="2E75B6"/>
+          <w:sz w:val="26"/>
+          <w:szCs w:val="26"/>
+        </w:rPr>
+        <w:t xml:space="preserve">6.4 Alternatives Considered and Rejected</w:t>
+      </w:r>
+    </w:p>
+    <w:p>
+      <w:pPr>
+        <w:pStyle w:val="ListParagraph"/>
+        <w:numPr>
+          <w:ilvl w:val="0"/>
+          <w:numId w:val="2"/>
+        </w:numPr>
+        <w:spacing w:before="50" w:after="50"/>
+      </w:pPr>
+      <w:r>
+        <w:rPr>
+          <w:rFonts w:ascii="Arial" w:cs="Arial" w:eastAsia="Arial" w:hAnsi="Arial"/>
+          <w:b/>
+          <w:bCs/>
+          <w:sz w:val="20"/>
+          <w:szCs w:val="20"/>
+        </w:rPr>
+        <w:t xml:space="preserve">DER (ASN.1). </w:t>
+      </w:r>
+      <w:r>
+        <w:rPr>
+          <w:rFonts w:ascii="Arial" w:cs="Arial" w:eastAsia="Arial" w:hAnsi="Arial"/>
+          <w:sz w:val="20"/>
+          <w:szCs w:val="20"/>
+        </w:rPr>
+        <w:t xml:space="preserve">Adds 4–6 bytes per message with no disambiguation benefit for a fixed-length type. Introduces a DER parser attack surface. No cross-platform interop requirement exists in this protocol.</w:t>
+      </w:r>
+    </w:p>
+    <w:p>
+      <w:pPr>
+        <w:pStyle w:val="ListParagraph"/>
+        <w:numPr>
+          <w:ilvl w:val="0"/>
+          <w:numId w:val="2"/>
+        </w:numPr>
+        <w:spacing w:before="50" w:after="50"/>
+      </w:pPr>
+      <w:r>
+        <w:rPr>
+          <w:rFonts w:ascii="Arial" w:cs="Arial" w:eastAsia="Arial" w:hAnsi="Arial"/>
+          <w:b/>
+          <w:bCs/>
+          <w:sz w:val="20"/>
+          <w:szCs w:val="20"/>
+        </w:rPr>
+        <w:t xml:space="preserve">DER for future multi-parameter-set support. </w:t>
+      </w:r>
+      <w:r>
+        <w:rPr>
+          <w:rFonts w:ascii="Arial" w:cs="Arial" w:eastAsia="Arial" w:hAnsi="Arial"/>
+          <w:sz w:val="20"/>
+          <w:szCs w:val="20"/>
+        </w:rPr>
+        <w:t xml:space="preserve">Premature. A parameter set migration warrants a protocol version bump and a new ADR, not speculative complexity in v1 messages.</w:t>
+      </w:r>
+    </w:p>
+    <w:p>
+      <w:pPr>
+        <w:pStyle w:val="ListParagraph"/>
+        <w:numPr>
+          <w:ilvl w:val="0"/>
+          <w:numId w:val="2"/>
+        </w:numPr>
+        <w:spacing w:before="50" w:after="50"/>
+      </w:pPr>
+      <w:r>
+        <w:rPr>
+          <w:rFonts w:ascii="Arial" w:cs="Arial" w:eastAsia="Arial" w:hAnsi="Arial"/>
+          <w:b/>
+          <w:bCs/>
+          <w:sz w:val="20"/>
+          <w:szCs w:val="20"/>
+        </w:rPr>
+        <w:t xml:space="preserve">Base64 encoding. </w:t>
+      </w:r>
+      <w:r>
+        <w:rPr>
+          <w:rFonts w:ascii="Arial" w:cs="Arial" w:eastAsia="Arial" w:hAnsi="Arial"/>
+          <w:sz w:val="20"/>
+          <w:szCs w:val="20"/>
+        </w:rPr>
+        <w:t xml:space="preserve">~33% wire overhead with no benefit. Protobuf bytes fields are binary-safe; no text encoding layer is needed.</w:t>
+      </w:r>
+    </w:p>
+    <w:p>
+      <w:pPr>
+        <w:spacing w:before="100" w:after="100"/>
+      </w:pPr>
+      <w:r>
+        <w:t xml:space="preserve"/>
+      </w:r>
+    </w:p>
+    <w:p>
+      <w:pPr>
+        <w:pStyle w:val="Heading1"/>
+        <w:spacing w:before="320" w:after="160"/>
+      </w:pPr>
+      <w:r>
+        <w:rPr>
+          <w:rFonts w:ascii="Arial" w:cs="Arial" w:eastAsia="Arial" w:hAnsi="Arial"/>
+          <w:b/>
+          <w:bCs/>
+          <w:color w:val="1F3864"/>
+          <w:sz w:val="32"/>
+          <w:szCs w:val="32"/>
+        </w:rPr>
+        <w:t xml:space="preserve">7. Related ADRs</w:t>
       </w:r>
     </w:p>
     <w:p>

</xml_diff>